<commit_message>
Ospitalità: il team del documento è quello della proposta Collinelli
Nei «chi se ne occupa» entrano i ruoli come li presentiamo al cliente
(Riccardo social, Nadir siti, Claudio copy, Alessandro ads), non i nomi
interni. Restano dichiarati i due servizi che nessun ruolo copre.

Co-Authored-By: Claude Opus 5 <noreply@anthropic.com>
</commit_message>
<xml_diff>
--- a/materiali/YDG - Ospitalita - PRECOMPILATO 16-10.docx
+++ b/materiali/YDG - Ospitalita - PRECOMPILATO 16-10.docx
@@ -453,7 +453,7 @@
               <w:spacing w:after="120" w:before="0"/>
             </w:pPr>
             <w:r>
-              <w:t>DA VERIFICARE — la squadra oggi è Alex (strategia e rapporto col cliente), Frenci (copy), Lia (grafica), Kevin (montaggio video), Jimmi (riprese). Chi copre l'ospitalità, e con che carico, è da assegnare: è anche la domanda aperta «Chi fa cosa» della Parte 4.</w:t>
+              <w:t>Riccardo, Socio e Responsabile Social Media, tiene il servizio. Claudio (Strategia &amp; Copywriter) scrive, Lia (Graphic Designer) fa le grafiche, Kevin (Video Editor) monta, Gianmarco (Videomaker) e Mihaela (Photographer) girano e fotografano. Alex tiene il rapporto col cliente. DA VERIFICARE — quante strutture può reggere questa squadra in parallelo, e chi è il referente unico per l'ospitalità.</w:t>
             </w:r>
           </w:p>
         </w:tc>
@@ -1013,7 +1013,7 @@
               <w:spacing w:after="120" w:before="0"/>
             </w:pPr>
             <w:r>
-              <w:t>DA VERIFICARE — chi sviluppa i siti e chi li mantiene va scritto qui: nelle nostre fonti il servizio non ha un responsabile assegnato.</w:t>
+              <w:t>Nadir, Socio e Responsabile Siti Web. DA VERIFICARE — il motore di prenotazione diretta è fuori da quello che abbiamo già fatto: va deciso con lui se lo sviluppa, con quale strumento e a che costo.</w:t>
             </w:r>
           </w:p>
         </w:tc>
@@ -1573,7 +1573,7 @@
               <w:spacing w:after="120" w:before="0"/>
             </w:pPr>
             <w:r>
-              <w:t>DA VERIFICARE — nessuno in squadra risulta averlo mai fatto. Prima del prezzo serve decidere se lo impariamo, se lo appaltiamo a un collaboratore, o se non lo mettiamo in brochure.</w:t>
+              <w:t>DA VERIFICARE — nessun ruolo del team copre i portali: nella squadra della proposta non c'è una figura per Booking, AirBnB o channel manager. Va deciso se la impariamo, se la appaltiamo o se il servizio non entra in brochure.</w:t>
             </w:r>
           </w:p>
         </w:tc>
@@ -2133,7 +2133,7 @@
               <w:spacing w:after="120" w:before="0"/>
             </w:pPr>
             <w:r>
-              <w:t>DA VERIFICARE — da assegnare: oggi il servizio non ha un responsabile né uno strumento scelto.</w:t>
+              <w:t>DA VERIFICARE — nessun ruolo dedicato. I testi delle email li scriverebbe Claudio (Strategia &amp; Copywriter), ma chi tiene lo strumento e i flussi è da assegnare.</w:t>
             </w:r>
           </w:p>
         </w:tc>
@@ -2693,7 +2693,7 @@
               <w:spacing w:after="120" w:before="0"/>
             </w:pPr>
             <w:r>
-              <w:t>DA VERIFICARE — oggi le sponsorizzate sui clienti le segue Alex. Per il verticale va deciso se resta così.</w:t>
+              <w:t>Alessandro, Ads Specialist. DA VERIFICARE — per il verticale va confermato se segue anche la parte strategica o solo l'esecuzione delle campagne.</w:t>
             </w:r>
           </w:p>
         </w:tc>

</xml_diff>

<commit_message>
Ospitalità: costi e note tornano vuoti nel precompilato
Setup, fee e note dei cinque servizi e tutte le tre simulazioni di
prezzo restano da decidere: meglio una casella bianca di un numero
prestato dal listino di un altro settore.

Co-Authored-By: Claude Opus 5 <noreply@anthropic.com>
</commit_message>
<xml_diff>
--- a/materiali/YDG - Ospitalita - PRECOMPILATO 16-10.docx
+++ b/materiali/YDG - Ospitalita - PRECOMPILATO 16-10.docx
@@ -139,7 +139,7 @@
         <w:spacing w:after="120" w:before="0"/>
       </w:pPr>
       <w:r>
-        <w:t>PRECOMPILATO il 16/10/2026 con quello che risulta dalle fonti YDG (lista clienti, knowledge base, schede cliente, storico dei 43 preventivi 2026). Tutto ciò che è marcato «DA VERIFICARE» è un buco dichiarato, non una dimenticanza: nessun numero è stato inventato. I prezzi vengono dal listino 2026 fatto su commercio e servizi, mai su hotel.</w:t>
+        <w:t>PRECOMPILATO il 16/10/2026 con quello che risulta dalle fonti YDG (lista clienti, knowledge base, schede cliente, proposta Collinelli per i ruoli del team). Tutto ciò che è marcato «DA VERIFICARE» è un buco dichiarato, non una dimenticanza: nessun numero è stato inventato. Costi, fee e note restano volutamente vuoti: i prezzi dell ospitalità non sono ancora decisi.</w:t>
       </w:r>
     </w:p>
     <w:p>
@@ -600,7 +600,7 @@
               <w:spacing w:after="120" w:before="0"/>
             </w:pPr>
             <w:r>
-              <w:t>200 € (START a listino 2026, uguale per tutti i pacchetti).</w:t>
+              <w:t xml:space="preserve"> </w:t>
             </w:r>
           </w:p>
         </w:tc>
@@ -649,7 +649,7 @@
               <w:spacing w:after="120" w:before="0"/>
             </w:pPr>
             <w:r>
-              <w:t>650 € per 4 post · 850 € per 8 · 1.200 € per 12. Il salto 4→8 è +200 €, mai il doppio.</w:t>
+              <w:t xml:space="preserve"> </w:t>
             </w:r>
           </w:p>
         </w:tc>
@@ -747,7 +747,7 @@
               <w:spacing w:after="120" w:before="0"/>
             </w:pPr>
             <w:r>
-              <w:t>L'ADV è SEMPRE esclusa da questo pacchetto (regola del listino 2026): il budget pubblicitario è del cliente e si tratta a parte. DA VERIFICARE — i prezzi qui sopra vengono dallo storico dei 43 preventivi 2026, fatti su commercio e servizi, NON su hotel: vanno confermati per l'ospitalità.</w:t>
+              <w:t xml:space="preserve"> </w:t>
             </w:r>
           </w:p>
         </w:tc>
@@ -1160,7 +1160,7 @@
               <w:spacing w:after="120" w:before="0"/>
             </w:pPr>
             <w:r>
-              <w:t>Landing 900 € · sito completo 1.300-1.900 € secondo le pagine. DA VERIFICARE — sono i prezzi storici YDG fuori ospitalità e SENZA motore di prenotazione: col booking engine il numero cambia.</w:t>
+              <w:t xml:space="preserve"> </w:t>
             </w:r>
           </w:p>
         </w:tc>
@@ -1209,7 +1209,7 @@
               <w:spacing w:after="120" w:before="0"/>
             </w:pPr>
             <w:r>
-              <w:t>Nessuna fee mensile: il mantenimento è 300-350 € all'anno.</w:t>
+              <w:t xml:space="preserve"> </w:t>
             </w:r>
           </w:p>
         </w:tc>
@@ -1307,7 +1307,7 @@
               <w:spacing w:after="120" w:before="0"/>
             </w:pPr>
             <w:r>
-              <w:t>È il servizio con lo scarto più grande tra quello che sappiamo fare (siti) e quello che l'ospitalità chiede (prenotazione diretta vera). Da chiarire prima del 6 novembre, perché è la leva che toglie commissioni, cioè l'argomento che vende.</w:t>
+              <w:t xml:space="preserve"> </w:t>
             </w:r>
           </w:p>
         </w:tc>
@@ -1720,7 +1720,7 @@
               <w:spacing w:after="120" w:before="0"/>
             </w:pPr>
             <w:r>
-              <w:t>DA VERIFICARE — nessun listino storico.</w:t>
+              <w:t xml:space="preserve"> </w:t>
             </w:r>
           </w:p>
         </w:tc>
@@ -1769,7 +1769,7 @@
               <w:spacing w:after="120" w:before="0"/>
             </w:pPr>
             <w:r>
-              <w:t>DA VERIFICARE — nessun listino storico.</w:t>
+              <w:t xml:space="preserve"> </w:t>
             </w:r>
           </w:p>
         </w:tc>
@@ -1867,7 +1867,7 @@
               <w:spacing w:after="120" w:before="0"/>
             </w:pPr>
             <w:r>
-              <w:t>È il servizio più scoperto dei cinque, ed è anche quello che gli albergatori chiedono per primo. Decisione da prendere insieme, non casella da riempire.</w:t>
+              <w:t xml:space="preserve"> </w:t>
             </w:r>
           </w:p>
         </w:tc>
@@ -2280,7 +2280,7 @@
               <w:spacing w:after="120" w:before="0"/>
             </w:pPr>
             <w:r>
-              <w:t>DA VERIFICARE — nessun listino storico.</w:t>
+              <w:t xml:space="preserve"> </w:t>
             </w:r>
           </w:p>
         </w:tc>
@@ -2329,7 +2329,7 @@
               <w:spacing w:after="120" w:before="0"/>
             </w:pPr>
             <w:r>
-              <w:t>DA VERIFICARE — nessun listino storico.</w:t>
+              <w:t xml:space="preserve"> </w:t>
             </w:r>
           </w:p>
         </w:tc>
@@ -2427,7 +2427,7 @@
               <w:spacing w:after="120" w:before="0"/>
             </w:pPr>
             <w:r>
-              <w:t>Insieme al Booking è il secondo buco da colmare prima di stampare la brochure.</w:t>
+              <w:t xml:space="preserve"> </w:t>
             </w:r>
           </w:p>
         </w:tc>
@@ -2840,7 +2840,7 @@
               <w:spacing w:after="120" w:before="0"/>
             </w:pPr>
             <w:r>
-              <w:t>DA VERIFICARE — nessun setup a listino.</w:t>
+              <w:t xml:space="preserve"> </w:t>
             </w:r>
           </w:p>
         </w:tc>
@@ -2889,7 +2889,7 @@
               <w:spacing w:after="120" w:before="0"/>
             </w:pPr>
             <w:r>
-              <w:t>DA VERIFICARE — a listino l'ADV è sempre esclusa dal pacchetto social e il budget media resta del cliente, ma una fee di gestione per l'ospitalità non è mai stata fissata. Va decisa: è la Parte 4.</w:t>
+              <w:t xml:space="preserve"> </w:t>
             </w:r>
           </w:p>
         </w:tc>
@@ -2987,7 +2987,7 @@
               <w:spacing w:after="120" w:before="0"/>
             </w:pPr>
             <w:r>
-              <w:t>Nella lista delle 50 strutture, chi già investe in ADV prende punti: vuol dire che il budget c'è ed è abituato a spenderlo.</w:t>
+              <w:t xml:space="preserve"> </w:t>
             </w:r>
           </w:p>
         </w:tc>
@@ -7905,7 +7905,7 @@
               <w:spacing w:after="120" w:before="0"/>
             </w:pPr>
             <w:r>
-              <w:t>200 €</w:t>
+              <w:t xml:space="preserve"> </w:t>
             </w:r>
           </w:p>
         </w:tc>
@@ -7924,7 +7924,7 @@
               <w:spacing w:after="120" w:before="0"/>
             </w:pPr>
             <w:r>
-              <w:t>650 €</w:t>
+              <w:t xml:space="preserve"> </w:t>
             </w:r>
           </w:p>
         </w:tc>
@@ -7943,7 +7943,7 @@
               <w:spacing w:after="120" w:before="0"/>
             </w:pPr>
             <w:r>
-              <w:t>Pacchetto 4 post: parte leggero, chi non ha mai pubblicato non regge 12 post dal primo mese.</w:t>
+              <w:t xml:space="preserve"> </w:t>
             </w:r>
           </w:p>
         </w:tc>
@@ -7992,7 +7992,7 @@
               <w:spacing w:after="120" w:before="0"/>
             </w:pPr>
             <w:r>
-              <w:t>1.300-1.900 €</w:t>
+              <w:t xml:space="preserve"> </w:t>
             </w:r>
           </w:p>
         </w:tc>
@@ -8011,7 +8011,7 @@
               <w:spacing w:after="120" w:before="0"/>
             </w:pPr>
             <w:r>
-              <w:t>300-350 € l'anno</w:t>
+              <w:t xml:space="preserve"> </w:t>
             </w:r>
           </w:p>
         </w:tc>
@@ -8030,7 +8030,7 @@
               <w:spacing w:after="120" w:before="0"/>
             </w:pPr>
             <w:r>
-              <w:t>Non ha sito: qui si costruisce da zero. Prezzo storico YDG, SENZA motore di prenotazione (da definire).</w:t>
+              <w:t xml:space="preserve"> </w:t>
             </w:r>
           </w:p>
         </w:tc>
@@ -8079,12 +8079,93 @@
               <w:spacing w:after="120" w:before="0"/>
             </w:pPr>
             <w:r>
-              <w:rPr>
-                <w:rFonts w:ascii="Calibri" w:cs="Calibri" w:eastAsia="Calibri" w:hAnsi="Calibri"/>
+              <w:t xml:space="preserve"> </w:t>
+            </w:r>
+          </w:p>
+        </w:tc>
+        <w:tc>
+          <w:tcPr>
+            <w:tcW w:type="dxa" w:w="1900"/>
+            <w:tcMar>
+              <w:top w:type="dxa" w:w="90"/>
+              <w:left w:type="dxa" w:w="120"/>
+              <w:bottom w:type="dxa" w:w="90"/>
+              <w:right w:type="dxa" w:w="120"/>
+            </w:tcMar>
+          </w:tcPr>
+          <w:p>
+            <w:pPr>
+              <w:spacing w:after="120" w:before="0"/>
+            </w:pPr>
+            <w:r>
+              <w:t xml:space="preserve"> </w:t>
+            </w:r>
+          </w:p>
+        </w:tc>
+        <w:tc>
+          <w:tcPr>
+            <w:tcW w:type="dxa" w:w="2738"/>
+            <w:tcMar>
+              <w:top w:type="dxa" w:w="90"/>
+              <w:left w:type="dxa" w:w="120"/>
+              <w:bottom w:type="dxa" w:w="90"/>
+              <w:right w:type="dxa" w:w="120"/>
+            </w:tcMar>
+          </w:tcPr>
+          <w:p>
+            <w:pPr>
+              <w:spacing w:after="120" w:before="0"/>
+            </w:pPr>
+            <w:r>
+              <w:t xml:space="preserve"> </w:t>
+            </w:r>
+          </w:p>
+        </w:tc>
+      </w:tr>
+      <w:tr>
+        <w:tc>
+          <w:tcPr>
+            <w:tcW w:type="dxa" w:w="3100"/>
+            <w:shd w:fill="EFEFEF" w:color="auto" w:val="clear"/>
+            <w:tcMar>
+              <w:top w:type="dxa" w:w="90"/>
+              <w:left w:type="dxa" w:w="120"/>
+              <w:bottom w:type="dxa" w:w="90"/>
+              <w:right w:type="dxa" w:w="120"/>
+            </w:tcMar>
+          </w:tcPr>
+          <w:p>
+            <w:pPr>
+              <w:spacing w:after="120" w:before="0"/>
+            </w:pPr>
+            <w:r>
+              <w:rPr>
+                <w:rFonts w:ascii="Calibri" w:cs="Calibri" w:eastAsia="Calibri" w:hAnsi="Calibri"/>
+                <w:b/>
+                <w:bCs/>
                 <w:color w:val="1A1A1A"/>
-                <w:sz w:val="20"/>
-                <w:szCs w:val="20"/>
-              </w:rPr>
+                <w:sz w:val="18"/>
+                <w:szCs w:val="18"/>
+              </w:rPr>
+              <w:t xml:space="preserve">Sviluppo CRM + Email marketing</w:t>
+            </w:r>
+          </w:p>
+        </w:tc>
+        <w:tc>
+          <w:tcPr>
+            <w:tcW w:type="dxa" w:w="1900"/>
+            <w:tcMar>
+              <w:top w:type="dxa" w:w="90"/>
+              <w:left w:type="dxa" w:w="120"/>
+              <w:bottom w:type="dxa" w:w="90"/>
+              <w:right w:type="dxa" w:w="120"/>
+            </w:tcMar>
+          </w:tcPr>
+          <w:p>
+            <w:pPr>
+              <w:spacing w:after="120" w:before="0"/>
+            </w:pPr>
+            <w:r>
               <w:t xml:space="preserve"> </w:t>
             </w:r>
           </w:p>
@@ -8104,18 +8185,99 @@
               <w:spacing w:after="120" w:before="0"/>
             </w:pPr>
             <w:r>
-              <w:rPr>
-                <w:rFonts w:ascii="Calibri" w:cs="Calibri" w:eastAsia="Calibri" w:hAnsi="Calibri"/>
+              <w:t xml:space="preserve"> </w:t>
+            </w:r>
+          </w:p>
+        </w:tc>
+        <w:tc>
+          <w:tcPr>
+            <w:tcW w:type="dxa" w:w="2738"/>
+            <w:tcMar>
+              <w:top w:type="dxa" w:w="90"/>
+              <w:left w:type="dxa" w:w="120"/>
+              <w:bottom w:type="dxa" w:w="90"/>
+              <w:right w:type="dxa" w:w="120"/>
+            </w:tcMar>
+          </w:tcPr>
+          <w:p>
+            <w:pPr>
+              <w:spacing w:after="120" w:before="0"/>
+            </w:pPr>
+            <w:r>
+              <w:t xml:space="preserve"> </w:t>
+            </w:r>
+          </w:p>
+        </w:tc>
+      </w:tr>
+      <w:tr>
+        <w:tc>
+          <w:tcPr>
+            <w:tcW w:type="dxa" w:w="3100"/>
+            <w:shd w:fill="EFEFEF" w:color="auto" w:val="clear"/>
+            <w:tcMar>
+              <w:top w:type="dxa" w:w="90"/>
+              <w:left w:type="dxa" w:w="120"/>
+              <w:bottom w:type="dxa" w:w="90"/>
+              <w:right w:type="dxa" w:w="120"/>
+            </w:tcMar>
+          </w:tcPr>
+          <w:p>
+            <w:pPr>
+              <w:spacing w:after="120" w:before="0"/>
+            </w:pPr>
+            <w:r>
+              <w:rPr>
+                <w:rFonts w:ascii="Calibri" w:cs="Calibri" w:eastAsia="Calibri" w:hAnsi="Calibri"/>
+                <w:b/>
+                <w:bCs/>
                 <w:color w:val="1A1A1A"/>
-                <w:sz w:val="20"/>
-                <w:szCs w:val="20"/>
-              </w:rPr>
+                <w:sz w:val="18"/>
+                <w:szCs w:val="18"/>
+              </w:rPr>
+              <w:t xml:space="preserve">Gestione ADV</w:t>
+            </w:r>
+          </w:p>
+        </w:tc>
+        <w:tc>
+          <w:tcPr>
+            <w:tcW w:type="dxa" w:w="1900"/>
+            <w:tcMar>
+              <w:top w:type="dxa" w:w="90"/>
+              <w:left w:type="dxa" w:w="120"/>
+              <w:bottom w:type="dxa" w:w="90"/>
+              <w:right w:type="dxa" w:w="120"/>
+            </w:tcMar>
+          </w:tcPr>
+          <w:p>
+            <w:pPr>
+              <w:spacing w:after="120" w:before="0"/>
+            </w:pPr>
+            <w:r>
               <w:t xml:space="preserve"> </w:t>
             </w:r>
           </w:p>
         </w:tc>
         <w:tc>
           <w:tcPr>
+            <w:tcW w:type="dxa" w:w="1900"/>
+            <w:tcMar>
+              <w:top w:type="dxa" w:w="90"/>
+              <w:left w:type="dxa" w:w="120"/>
+              <w:bottom w:type="dxa" w:w="90"/>
+              <w:right w:type="dxa" w:w="120"/>
+            </w:tcMar>
+          </w:tcPr>
+          <w:p>
+            <w:pPr>
+              <w:spacing w:after="120" w:before="0"/>
+            </w:pPr>
+            <w:r>
+              <w:t xml:space="preserve"> </w:t>
+            </w:r>
+          </w:p>
+        </w:tc>
+        <w:tc>
+          <w:tcPr>
             <w:tcW w:type="dxa" w:w="2738"/>
             <w:tcMar>
               <w:top w:type="dxa" w:w="90"/>
@@ -8129,205 +8291,7 @@
               <w:spacing w:after="120" w:before="0"/>
             </w:pPr>
             <w:r>
-              <w:t>Lasciato vuoto: non sappiamo ancora erogarlo (vedi Parte 1, servizio 3).</w:t>
-            </w:r>
-          </w:p>
-        </w:tc>
-      </w:tr>
-      <w:tr>
-        <w:tc>
-          <w:tcPr>
-            <w:tcW w:type="dxa" w:w="3100"/>
-            <w:shd w:fill="EFEFEF" w:color="auto" w:val="clear"/>
-            <w:tcMar>
-              <w:top w:type="dxa" w:w="90"/>
-              <w:left w:type="dxa" w:w="120"/>
-              <w:bottom w:type="dxa" w:w="90"/>
-              <w:right w:type="dxa" w:w="120"/>
-            </w:tcMar>
-          </w:tcPr>
-          <w:p>
-            <w:pPr>
-              <w:spacing w:after="120" w:before="0"/>
-            </w:pPr>
-            <w:r>
-              <w:rPr>
-                <w:rFonts w:ascii="Calibri" w:cs="Calibri" w:eastAsia="Calibri" w:hAnsi="Calibri"/>
-                <w:b/>
-                <w:bCs/>
-                <w:color w:val="1A1A1A"/>
-                <w:sz w:val="18"/>
-                <w:szCs w:val="18"/>
-              </w:rPr>
-              <w:t xml:space="preserve">Sviluppo CRM + Email marketing</w:t>
-            </w:r>
-          </w:p>
-        </w:tc>
-        <w:tc>
-          <w:tcPr>
-            <w:tcW w:type="dxa" w:w="1900"/>
-            <w:tcMar>
-              <w:top w:type="dxa" w:w="90"/>
-              <w:left w:type="dxa" w:w="120"/>
-              <w:bottom w:type="dxa" w:w="90"/>
-              <w:right w:type="dxa" w:w="120"/>
-            </w:tcMar>
-          </w:tcPr>
-          <w:p>
-            <w:pPr>
-              <w:spacing w:after="120" w:before="0"/>
-            </w:pPr>
-            <w:r>
-              <w:rPr>
-                <w:rFonts w:ascii="Calibri" w:cs="Calibri" w:eastAsia="Calibri" w:hAnsi="Calibri"/>
-                <w:color w:val="1A1A1A"/>
-                <w:sz w:val="20"/>
-                <w:szCs w:val="20"/>
-              </w:rPr>
               <w:t xml:space="preserve"> </w:t>
-            </w:r>
-          </w:p>
-        </w:tc>
-        <w:tc>
-          <w:tcPr>
-            <w:tcW w:type="dxa" w:w="1900"/>
-            <w:tcMar>
-              <w:top w:type="dxa" w:w="90"/>
-              <w:left w:type="dxa" w:w="120"/>
-              <w:bottom w:type="dxa" w:w="90"/>
-              <w:right w:type="dxa" w:w="120"/>
-            </w:tcMar>
-          </w:tcPr>
-          <w:p>
-            <w:pPr>
-              <w:spacing w:after="120" w:before="0"/>
-            </w:pPr>
-            <w:r>
-              <w:rPr>
-                <w:rFonts w:ascii="Calibri" w:cs="Calibri" w:eastAsia="Calibri" w:hAnsi="Calibri"/>
-                <w:color w:val="1A1A1A"/>
-                <w:sz w:val="20"/>
-                <w:szCs w:val="20"/>
-              </w:rPr>
-              <w:t xml:space="preserve"> </w:t>
-            </w:r>
-          </w:p>
-        </w:tc>
-        <w:tc>
-          <w:tcPr>
-            <w:tcW w:type="dxa" w:w="2738"/>
-            <w:tcMar>
-              <w:top w:type="dxa" w:w="90"/>
-              <w:left w:type="dxa" w:w="120"/>
-              <w:bottom w:type="dxa" w:w="90"/>
-              <w:right w:type="dxa" w:w="120"/>
-            </w:tcMar>
-          </w:tcPr>
-          <w:p>
-            <w:pPr>
-              <w:spacing w:after="120" w:before="0"/>
-            </w:pPr>
-            <w:r>
-              <w:t>Lasciato vuoto: stesso motivo. Con un 3 stelle senza database è comunque prematuro.</w:t>
-            </w:r>
-          </w:p>
-        </w:tc>
-      </w:tr>
-      <w:tr>
-        <w:tc>
-          <w:tcPr>
-            <w:tcW w:type="dxa" w:w="3100"/>
-            <w:shd w:fill="EFEFEF" w:color="auto" w:val="clear"/>
-            <w:tcMar>
-              <w:top w:type="dxa" w:w="90"/>
-              <w:left w:type="dxa" w:w="120"/>
-              <w:bottom w:type="dxa" w:w="90"/>
-              <w:right w:type="dxa" w:w="120"/>
-            </w:tcMar>
-          </w:tcPr>
-          <w:p>
-            <w:pPr>
-              <w:spacing w:after="120" w:before="0"/>
-            </w:pPr>
-            <w:r>
-              <w:rPr>
-                <w:rFonts w:ascii="Calibri" w:cs="Calibri" w:eastAsia="Calibri" w:hAnsi="Calibri"/>
-                <w:b/>
-                <w:bCs/>
-                <w:color w:val="1A1A1A"/>
-                <w:sz w:val="18"/>
-                <w:szCs w:val="18"/>
-              </w:rPr>
-              <w:t xml:space="preserve">Gestione ADV</w:t>
-            </w:r>
-          </w:p>
-        </w:tc>
-        <w:tc>
-          <w:tcPr>
-            <w:tcW w:type="dxa" w:w="1900"/>
-            <w:tcMar>
-              <w:top w:type="dxa" w:w="90"/>
-              <w:left w:type="dxa" w:w="120"/>
-              <w:bottom w:type="dxa" w:w="90"/>
-              <w:right w:type="dxa" w:w="120"/>
-            </w:tcMar>
-          </w:tcPr>
-          <w:p>
-            <w:pPr>
-              <w:spacing w:after="120" w:before="0"/>
-            </w:pPr>
-            <w:r>
-              <w:rPr>
-                <w:rFonts w:ascii="Calibri" w:cs="Calibri" w:eastAsia="Calibri" w:hAnsi="Calibri"/>
-                <w:color w:val="1A1A1A"/>
-                <w:sz w:val="20"/>
-                <w:szCs w:val="20"/>
-              </w:rPr>
-              <w:t xml:space="preserve"> </w:t>
-            </w:r>
-          </w:p>
-        </w:tc>
-        <w:tc>
-          <w:tcPr>
-            <w:tcW w:type="dxa" w:w="1900"/>
-            <w:tcMar>
-              <w:top w:type="dxa" w:w="90"/>
-              <w:left w:type="dxa" w:w="120"/>
-              <w:bottom w:type="dxa" w:w="90"/>
-              <w:right w:type="dxa" w:w="120"/>
-            </w:tcMar>
-          </w:tcPr>
-          <w:p>
-            <w:pPr>
-              <w:spacing w:after="120" w:before="0"/>
-            </w:pPr>
-            <w:r>
-              <w:rPr>
-                <w:rFonts w:ascii="Calibri" w:cs="Calibri" w:eastAsia="Calibri" w:hAnsi="Calibri"/>
-                <w:color w:val="1A1A1A"/>
-                <w:sz w:val="20"/>
-                <w:szCs w:val="20"/>
-              </w:rPr>
-              <w:t xml:space="preserve"> </w:t>
-            </w:r>
-          </w:p>
-        </w:tc>
-        <w:tc>
-          <w:tcPr>
-            <w:tcW w:type="dxa" w:w="2738"/>
-            <w:tcMar>
-              <w:top w:type="dxa" w:w="90"/>
-              <w:left w:type="dxa" w:w="120"/>
-              <w:bottom w:type="dxa" w:w="90"/>
-              <w:right w:type="dxa" w:w="120"/>
-            </w:tcMar>
-          </w:tcPr>
-          <w:p>
-            <w:pPr>
-              <w:spacing w:after="120" w:before="0"/>
-            </w:pPr>
-            <w:r>
-              <w:t>Budget media del cliente; la fee di gestione non è fissata. Su un 3 stelle senza sito, prima il sito.</w:t>
             </w:r>
           </w:p>
         </w:tc>
@@ -8377,7 +8341,7 @@
               <w:spacing w:after="120" w:before="0"/>
             </w:pPr>
             <w:r>
-              <w:t>1.500-2.100 €</w:t>
+              <w:t xml:space="preserve"> </w:t>
             </w:r>
           </w:p>
         </w:tc>
@@ -8397,7 +8361,7 @@
               <w:spacing w:after="120" w:before="0"/>
             </w:pPr>
             <w:r>
-              <w:t>650 € + 300-350 € l'anno</w:t>
+              <w:t xml:space="preserve"> </w:t>
             </w:r>
           </w:p>
         </w:tc>
@@ -8417,7 +8381,7 @@
               <w:spacing w:after="120" w:before="0"/>
             </w:pPr>
             <w:r>
-              <w:t>DA VERIFICARE — tutti i numeri vengono dal listino 2026 fuori ospitalità.</w:t>
+              <w:t xml:space="preserve"> </w:t>
             </w:r>
           </w:p>
         </w:tc>
@@ -8631,7 +8595,7 @@
               <w:spacing w:after="120" w:before="0"/>
             </w:pPr>
             <w:r>
-              <w:t>200 €</w:t>
+              <w:t xml:space="preserve"> </w:t>
             </w:r>
           </w:p>
         </w:tc>
@@ -8650,7 +8614,7 @@
               <w:spacing w:after="120" w:before="0"/>
             </w:pPr>
             <w:r>
-              <w:t>850 €</w:t>
+              <w:t xml:space="preserve"> </w:t>
             </w:r>
           </w:p>
         </w:tc>
@@ -8669,7 +8633,7 @@
               <w:spacing w:after="120" w:before="0"/>
             </w:pPr>
             <w:r>
-              <w:t>Pacchetto 8 post: struttura avviata, regge due uscite a settimana.</w:t>
+              <w:t xml:space="preserve"> </w:t>
             </w:r>
           </w:p>
         </w:tc>
@@ -8718,7 +8682,7 @@
               <w:spacing w:after="120" w:before="0"/>
             </w:pPr>
             <w:r>
-              <w:t>1.300-1.900 €</w:t>
+              <w:t xml:space="preserve"> </w:t>
             </w:r>
           </w:p>
         </w:tc>
@@ -8737,7 +8701,7 @@
               <w:spacing w:after="120" w:before="0"/>
             </w:pPr>
             <w:r>
-              <w:t>300-350 € l'anno</w:t>
+              <w:t xml:space="preserve"> </w:t>
             </w:r>
           </w:p>
         </w:tc>
@@ -8756,7 +8720,7 @@
               <w:spacing w:after="120" w:before="0"/>
             </w:pPr>
             <w:r>
-              <w:t>Restyling. Qui la prenotazione diretta è il punto: toglie commissioni sui portali che già usa.</w:t>
+              <w:t xml:space="preserve"> </w:t>
             </w:r>
           </w:p>
         </w:tc>
@@ -8805,12 +8769,93 @@
               <w:spacing w:after="120" w:before="0"/>
             </w:pPr>
             <w:r>
-              <w:rPr>
-                <w:rFonts w:ascii="Calibri" w:cs="Calibri" w:eastAsia="Calibri" w:hAnsi="Calibri"/>
+              <w:t xml:space="preserve"> </w:t>
+            </w:r>
+          </w:p>
+        </w:tc>
+        <w:tc>
+          <w:tcPr>
+            <w:tcW w:type="dxa" w:w="1900"/>
+            <w:tcMar>
+              <w:top w:type="dxa" w:w="90"/>
+              <w:left w:type="dxa" w:w="120"/>
+              <w:bottom w:type="dxa" w:w="90"/>
+              <w:right w:type="dxa" w:w="120"/>
+            </w:tcMar>
+          </w:tcPr>
+          <w:p>
+            <w:pPr>
+              <w:spacing w:after="120" w:before="0"/>
+            </w:pPr>
+            <w:r>
+              <w:t xml:space="preserve"> </w:t>
+            </w:r>
+          </w:p>
+        </w:tc>
+        <w:tc>
+          <w:tcPr>
+            <w:tcW w:type="dxa" w:w="2738"/>
+            <w:tcMar>
+              <w:top w:type="dxa" w:w="90"/>
+              <w:left w:type="dxa" w:w="120"/>
+              <w:bottom w:type="dxa" w:w="90"/>
+              <w:right w:type="dxa" w:w="120"/>
+            </w:tcMar>
+          </w:tcPr>
+          <w:p>
+            <w:pPr>
+              <w:spacing w:after="120" w:before="0"/>
+            </w:pPr>
+            <w:r>
+              <w:t xml:space="preserve"> </w:t>
+            </w:r>
+          </w:p>
+        </w:tc>
+      </w:tr>
+      <w:tr>
+        <w:tc>
+          <w:tcPr>
+            <w:tcW w:type="dxa" w:w="3100"/>
+            <w:shd w:fill="EFEFEF" w:color="auto" w:val="clear"/>
+            <w:tcMar>
+              <w:top w:type="dxa" w:w="90"/>
+              <w:left w:type="dxa" w:w="120"/>
+              <w:bottom w:type="dxa" w:w="90"/>
+              <w:right w:type="dxa" w:w="120"/>
+            </w:tcMar>
+          </w:tcPr>
+          <w:p>
+            <w:pPr>
+              <w:spacing w:after="120" w:before="0"/>
+            </w:pPr>
+            <w:r>
+              <w:rPr>
+                <w:rFonts w:ascii="Calibri" w:cs="Calibri" w:eastAsia="Calibri" w:hAnsi="Calibri"/>
+                <w:b/>
+                <w:bCs/>
                 <w:color w:val="1A1A1A"/>
-                <w:sz w:val="20"/>
-                <w:szCs w:val="20"/>
-              </w:rPr>
+                <w:sz w:val="18"/>
+                <w:szCs w:val="18"/>
+              </w:rPr>
+              <w:t xml:space="preserve">Sviluppo CRM + Email marketing</w:t>
+            </w:r>
+          </w:p>
+        </w:tc>
+        <w:tc>
+          <w:tcPr>
+            <w:tcW w:type="dxa" w:w="1900"/>
+            <w:tcMar>
+              <w:top w:type="dxa" w:w="90"/>
+              <w:left w:type="dxa" w:w="120"/>
+              <w:bottom w:type="dxa" w:w="90"/>
+              <w:right w:type="dxa" w:w="120"/>
+            </w:tcMar>
+          </w:tcPr>
+          <w:p>
+            <w:pPr>
+              <w:spacing w:after="120" w:before="0"/>
+            </w:pPr>
+            <w:r>
               <w:t xml:space="preserve"> </w:t>
             </w:r>
           </w:p>
@@ -8830,18 +8875,99 @@
               <w:spacing w:after="120" w:before="0"/>
             </w:pPr>
             <w:r>
-              <w:rPr>
-                <w:rFonts w:ascii="Calibri" w:cs="Calibri" w:eastAsia="Calibri" w:hAnsi="Calibri"/>
+              <w:t xml:space="preserve"> </w:t>
+            </w:r>
+          </w:p>
+        </w:tc>
+        <w:tc>
+          <w:tcPr>
+            <w:tcW w:type="dxa" w:w="2738"/>
+            <w:tcMar>
+              <w:top w:type="dxa" w:w="90"/>
+              <w:left w:type="dxa" w:w="120"/>
+              <w:bottom w:type="dxa" w:w="90"/>
+              <w:right w:type="dxa" w:w="120"/>
+            </w:tcMar>
+          </w:tcPr>
+          <w:p>
+            <w:pPr>
+              <w:spacing w:after="120" w:before="0"/>
+            </w:pPr>
+            <w:r>
+              <w:t xml:space="preserve"> </w:t>
+            </w:r>
+          </w:p>
+        </w:tc>
+      </w:tr>
+      <w:tr>
+        <w:tc>
+          <w:tcPr>
+            <w:tcW w:type="dxa" w:w="3100"/>
+            <w:shd w:fill="EFEFEF" w:color="auto" w:val="clear"/>
+            <w:tcMar>
+              <w:top w:type="dxa" w:w="90"/>
+              <w:left w:type="dxa" w:w="120"/>
+              <w:bottom w:type="dxa" w:w="90"/>
+              <w:right w:type="dxa" w:w="120"/>
+            </w:tcMar>
+          </w:tcPr>
+          <w:p>
+            <w:pPr>
+              <w:spacing w:after="120" w:before="0"/>
+            </w:pPr>
+            <w:r>
+              <w:rPr>
+                <w:rFonts w:ascii="Calibri" w:cs="Calibri" w:eastAsia="Calibri" w:hAnsi="Calibri"/>
+                <w:b/>
+                <w:bCs/>
                 <w:color w:val="1A1A1A"/>
-                <w:sz w:val="20"/>
-                <w:szCs w:val="20"/>
-              </w:rPr>
+                <w:sz w:val="18"/>
+                <w:szCs w:val="18"/>
+              </w:rPr>
+              <w:t xml:space="preserve">Gestione ADV</w:t>
+            </w:r>
+          </w:p>
+        </w:tc>
+        <w:tc>
+          <w:tcPr>
+            <w:tcW w:type="dxa" w:w="1900"/>
+            <w:tcMar>
+              <w:top w:type="dxa" w:w="90"/>
+              <w:left w:type="dxa" w:w="120"/>
+              <w:bottom w:type="dxa" w:w="90"/>
+              <w:right w:type="dxa" w:w="120"/>
+            </w:tcMar>
+          </w:tcPr>
+          <w:p>
+            <w:pPr>
+              <w:spacing w:after="120" w:before="0"/>
+            </w:pPr>
+            <w:r>
               <w:t xml:space="preserve"> </w:t>
             </w:r>
           </w:p>
         </w:tc>
         <w:tc>
           <w:tcPr>
+            <w:tcW w:type="dxa" w:w="1900"/>
+            <w:tcMar>
+              <w:top w:type="dxa" w:w="90"/>
+              <w:left w:type="dxa" w:w="120"/>
+              <w:bottom w:type="dxa" w:w="90"/>
+              <w:right w:type="dxa" w:w="120"/>
+            </w:tcMar>
+          </w:tcPr>
+          <w:p>
+            <w:pPr>
+              <w:spacing w:after="120" w:before="0"/>
+            </w:pPr>
+            <w:r>
+              <w:t xml:space="preserve"> </w:t>
+            </w:r>
+          </w:p>
+        </w:tc>
+        <w:tc>
+          <w:tcPr>
             <w:tcW w:type="dxa" w:w="2738"/>
             <w:tcMar>
               <w:top w:type="dxa" w:w="90"/>
@@ -8855,205 +8981,7 @@
               <w:spacing w:after="120" w:before="0"/>
             </w:pPr>
             <w:r>
-              <w:t>È già sui portali: servirebbe ottimizzazione e channel manager, che oggi non sappiamo erogare.</w:t>
-            </w:r>
-          </w:p>
-        </w:tc>
-      </w:tr>
-      <w:tr>
-        <w:tc>
-          <w:tcPr>
-            <w:tcW w:type="dxa" w:w="3100"/>
-            <w:shd w:fill="EFEFEF" w:color="auto" w:val="clear"/>
-            <w:tcMar>
-              <w:top w:type="dxa" w:w="90"/>
-              <w:left w:type="dxa" w:w="120"/>
-              <w:bottom w:type="dxa" w:w="90"/>
-              <w:right w:type="dxa" w:w="120"/>
-            </w:tcMar>
-          </w:tcPr>
-          <w:p>
-            <w:pPr>
-              <w:spacing w:after="120" w:before="0"/>
-            </w:pPr>
-            <w:r>
-              <w:rPr>
-                <w:rFonts w:ascii="Calibri" w:cs="Calibri" w:eastAsia="Calibri" w:hAnsi="Calibri"/>
-                <w:b/>
-                <w:bCs/>
-                <w:color w:val="1A1A1A"/>
-                <w:sz w:val="18"/>
-                <w:szCs w:val="18"/>
-              </w:rPr>
-              <w:t xml:space="preserve">Sviluppo CRM + Email marketing</w:t>
-            </w:r>
-          </w:p>
-        </w:tc>
-        <w:tc>
-          <w:tcPr>
-            <w:tcW w:type="dxa" w:w="1900"/>
-            <w:tcMar>
-              <w:top w:type="dxa" w:w="90"/>
-              <w:left w:type="dxa" w:w="120"/>
-              <w:bottom w:type="dxa" w:w="90"/>
-              <w:right w:type="dxa" w:w="120"/>
-            </w:tcMar>
-          </w:tcPr>
-          <w:p>
-            <w:pPr>
-              <w:spacing w:after="120" w:before="0"/>
-            </w:pPr>
-            <w:r>
-              <w:rPr>
-                <w:rFonts w:ascii="Calibri" w:cs="Calibri" w:eastAsia="Calibri" w:hAnsi="Calibri"/>
-                <w:color w:val="1A1A1A"/>
-                <w:sz w:val="20"/>
-                <w:szCs w:val="20"/>
-              </w:rPr>
               <w:t xml:space="preserve"> </w:t>
-            </w:r>
-          </w:p>
-        </w:tc>
-        <w:tc>
-          <w:tcPr>
-            <w:tcW w:type="dxa" w:w="1900"/>
-            <w:tcMar>
-              <w:top w:type="dxa" w:w="90"/>
-              <w:left w:type="dxa" w:w="120"/>
-              <w:bottom w:type="dxa" w:w="90"/>
-              <w:right w:type="dxa" w:w="120"/>
-            </w:tcMar>
-          </w:tcPr>
-          <w:p>
-            <w:pPr>
-              <w:spacing w:after="120" w:before="0"/>
-            </w:pPr>
-            <w:r>
-              <w:rPr>
-                <w:rFonts w:ascii="Calibri" w:cs="Calibri" w:eastAsia="Calibri" w:hAnsi="Calibri"/>
-                <w:color w:val="1A1A1A"/>
-                <w:sz w:val="20"/>
-                <w:szCs w:val="20"/>
-              </w:rPr>
-              <w:t xml:space="preserve"> </w:t>
-            </w:r>
-          </w:p>
-        </w:tc>
-        <w:tc>
-          <w:tcPr>
-            <w:tcW w:type="dxa" w:w="2738"/>
-            <w:tcMar>
-              <w:top w:type="dxa" w:w="90"/>
-              <w:left w:type="dxa" w:w="120"/>
-              <w:bottom w:type="dxa" w:w="90"/>
-              <w:right w:type="dxa" w:w="120"/>
-            </w:tcMar>
-          </w:tcPr>
-          <w:p>
-            <w:pPr>
-              <w:spacing w:after="120" w:before="0"/>
-            </w:pPr>
-            <w:r>
-              <w:t>Un 4 stelle avviato ha il database: è il caso in cui il CRM renderebbe di più, ed è il buco più caro da lasciare aperto.</w:t>
-            </w:r>
-          </w:p>
-        </w:tc>
-      </w:tr>
-      <w:tr>
-        <w:tc>
-          <w:tcPr>
-            <w:tcW w:type="dxa" w:w="3100"/>
-            <w:shd w:fill="EFEFEF" w:color="auto" w:val="clear"/>
-            <w:tcMar>
-              <w:top w:type="dxa" w:w="90"/>
-              <w:left w:type="dxa" w:w="120"/>
-              <w:bottom w:type="dxa" w:w="90"/>
-              <w:right w:type="dxa" w:w="120"/>
-            </w:tcMar>
-          </w:tcPr>
-          <w:p>
-            <w:pPr>
-              <w:spacing w:after="120" w:before="0"/>
-            </w:pPr>
-            <w:r>
-              <w:rPr>
-                <w:rFonts w:ascii="Calibri" w:cs="Calibri" w:eastAsia="Calibri" w:hAnsi="Calibri"/>
-                <w:b/>
-                <w:bCs/>
-                <w:color w:val="1A1A1A"/>
-                <w:sz w:val="18"/>
-                <w:szCs w:val="18"/>
-              </w:rPr>
-              <w:t xml:space="preserve">Gestione ADV</w:t>
-            </w:r>
-          </w:p>
-        </w:tc>
-        <w:tc>
-          <w:tcPr>
-            <w:tcW w:type="dxa" w:w="1900"/>
-            <w:tcMar>
-              <w:top w:type="dxa" w:w="90"/>
-              <w:left w:type="dxa" w:w="120"/>
-              <w:bottom w:type="dxa" w:w="90"/>
-              <w:right w:type="dxa" w:w="120"/>
-            </w:tcMar>
-          </w:tcPr>
-          <w:p>
-            <w:pPr>
-              <w:spacing w:after="120" w:before="0"/>
-            </w:pPr>
-            <w:r>
-              <w:rPr>
-                <w:rFonts w:ascii="Calibri" w:cs="Calibri" w:eastAsia="Calibri" w:hAnsi="Calibri"/>
-                <w:color w:val="1A1A1A"/>
-                <w:sz w:val="20"/>
-                <w:szCs w:val="20"/>
-              </w:rPr>
-              <w:t xml:space="preserve"> </w:t>
-            </w:r>
-          </w:p>
-        </w:tc>
-        <w:tc>
-          <w:tcPr>
-            <w:tcW w:type="dxa" w:w="1900"/>
-            <w:tcMar>
-              <w:top w:type="dxa" w:w="90"/>
-              <w:left w:type="dxa" w:w="120"/>
-              <w:bottom w:type="dxa" w:w="90"/>
-              <w:right w:type="dxa" w:w="120"/>
-            </w:tcMar>
-          </w:tcPr>
-          <w:p>
-            <w:pPr>
-              <w:spacing w:after="120" w:before="0"/>
-            </w:pPr>
-            <w:r>
-              <w:rPr>
-                <w:rFonts w:ascii="Calibri" w:cs="Calibri" w:eastAsia="Calibri" w:hAnsi="Calibri"/>
-                <w:color w:val="1A1A1A"/>
-                <w:sz w:val="20"/>
-                <w:szCs w:val="20"/>
-              </w:rPr>
-              <w:t xml:space="preserve"> </w:t>
-            </w:r>
-          </w:p>
-        </w:tc>
-        <w:tc>
-          <w:tcPr>
-            <w:tcW w:type="dxa" w:w="2738"/>
-            <w:tcMar>
-              <w:top w:type="dxa" w:w="90"/>
-              <w:left w:type="dxa" w:w="120"/>
-              <w:bottom w:type="dxa" w:w="90"/>
-              <w:right w:type="dxa" w:w="120"/>
-            </w:tcMar>
-          </w:tcPr>
-          <w:p>
-            <w:pPr>
-              <w:spacing w:after="120" w:before="0"/>
-            </w:pPr>
-            <w:r>
-              <w:t>Budget media del cliente; fee di gestione da fissare.</w:t>
             </w:r>
           </w:p>
         </w:tc>
@@ -9103,7 +9031,7 @@
               <w:spacing w:after="120" w:before="0"/>
             </w:pPr>
             <w:r>
-              <w:t>1.500-2.100 €</w:t>
+              <w:t xml:space="preserve"> </w:t>
             </w:r>
           </w:p>
         </w:tc>
@@ -9123,7 +9051,7 @@
               <w:spacing w:after="120" w:before="0"/>
             </w:pPr>
             <w:r>
-              <w:t>850 € + 300-350 € l'anno</w:t>
+              <w:t xml:space="preserve"> </w:t>
             </w:r>
           </w:p>
         </w:tc>
@@ -9143,7 +9071,7 @@
               <w:spacing w:after="120" w:before="0"/>
             </w:pPr>
             <w:r>
-              <w:t>DA VERIFICARE — mancano tre voci su cinque: come proposta «completa» oggi non regge.</w:t>
+              <w:t xml:space="preserve"> </w:t>
             </w:r>
           </w:p>
         </w:tc>
@@ -9357,7 +9285,7 @@
               <w:spacing w:after="120" w:before="0"/>
             </w:pPr>
             <w:r>
-              <w:t>200 €</w:t>
+              <w:t xml:space="preserve"> </w:t>
             </w:r>
           </w:p>
         </w:tc>
@@ -9376,7 +9304,7 @@
               <w:spacing w:after="120" w:before="0"/>
             </w:pPr>
             <w:r>
-              <w:t>1.200 €</w:t>
+              <w:t xml:space="preserve"> </w:t>
             </w:r>
           </w:p>
         </w:tc>
@@ -9395,7 +9323,7 @@
               <w:spacing w:after="120" w:before="0"/>
             </w:pPr>
             <w:r>
-              <w:t>Pacchetto 12 post: è la fascia bersaglio del verticale, tre uscite a settimana.</w:t>
+              <w:t xml:space="preserve"> </w:t>
             </w:r>
           </w:p>
         </w:tc>
@@ -9444,7 +9372,7 @@
               <w:spacing w:after="120" w:before="0"/>
             </w:pPr>
             <w:r>
-              <w:t>1.900 €</w:t>
+              <w:t xml:space="preserve"> </w:t>
             </w:r>
           </w:p>
         </w:tc>
@@ -9463,7 +9391,7 @@
               <w:spacing w:after="120" w:before="0"/>
             </w:pPr>
             <w:r>
-              <w:t>350 € l'anno</w:t>
+              <w:t xml:space="preserve"> </w:t>
             </w:r>
           </w:p>
         </w:tc>
@@ -9482,7 +9410,7 @@
               <w:spacing w:after="120" w:before="0"/>
             </w:pPr>
             <w:r>
-              <w:t>Sito completo. Per una boutique il sito È il canale di vendita, non una vetrina.</w:t>
+              <w:t xml:space="preserve"> </w:t>
             </w:r>
           </w:p>
         </w:tc>
@@ -9531,12 +9459,93 @@
               <w:spacing w:after="120" w:before="0"/>
             </w:pPr>
             <w:r>
-              <w:rPr>
-                <w:rFonts w:ascii="Calibri" w:cs="Calibri" w:eastAsia="Calibri" w:hAnsi="Calibri"/>
+              <w:t xml:space="preserve"> </w:t>
+            </w:r>
+          </w:p>
+        </w:tc>
+        <w:tc>
+          <w:tcPr>
+            <w:tcW w:type="dxa" w:w="1900"/>
+            <w:tcMar>
+              <w:top w:type="dxa" w:w="90"/>
+              <w:left w:type="dxa" w:w="120"/>
+              <w:bottom w:type="dxa" w:w="90"/>
+              <w:right w:type="dxa" w:w="120"/>
+            </w:tcMar>
+          </w:tcPr>
+          <w:p>
+            <w:pPr>
+              <w:spacing w:after="120" w:before="0"/>
+            </w:pPr>
+            <w:r>
+              <w:t xml:space="preserve"> </w:t>
+            </w:r>
+          </w:p>
+        </w:tc>
+        <w:tc>
+          <w:tcPr>
+            <w:tcW w:type="dxa" w:w="2738"/>
+            <w:tcMar>
+              <w:top w:type="dxa" w:w="90"/>
+              <w:left w:type="dxa" w:w="120"/>
+              <w:bottom w:type="dxa" w:w="90"/>
+              <w:right w:type="dxa" w:w="120"/>
+            </w:tcMar>
+          </w:tcPr>
+          <w:p>
+            <w:pPr>
+              <w:spacing w:after="120" w:before="0"/>
+            </w:pPr>
+            <w:r>
+              <w:t xml:space="preserve"> </w:t>
+            </w:r>
+          </w:p>
+        </w:tc>
+      </w:tr>
+      <w:tr>
+        <w:tc>
+          <w:tcPr>
+            <w:tcW w:type="dxa" w:w="3100"/>
+            <w:shd w:fill="EFEFEF" w:color="auto" w:val="clear"/>
+            <w:tcMar>
+              <w:top w:type="dxa" w:w="90"/>
+              <w:left w:type="dxa" w:w="120"/>
+              <w:bottom w:type="dxa" w:w="90"/>
+              <w:right w:type="dxa" w:w="120"/>
+            </w:tcMar>
+          </w:tcPr>
+          <w:p>
+            <w:pPr>
+              <w:spacing w:after="120" w:before="0"/>
+            </w:pPr>
+            <w:r>
+              <w:rPr>
+                <w:rFonts w:ascii="Calibri" w:cs="Calibri" w:eastAsia="Calibri" w:hAnsi="Calibri"/>
+                <w:b/>
+                <w:bCs/>
                 <w:color w:val="1A1A1A"/>
-                <w:sz w:val="20"/>
-                <w:szCs w:val="20"/>
-              </w:rPr>
+                <w:sz w:val="18"/>
+                <w:szCs w:val="18"/>
+              </w:rPr>
+              <w:t xml:space="preserve">Sviluppo CRM + Email marketing</w:t>
+            </w:r>
+          </w:p>
+        </w:tc>
+        <w:tc>
+          <w:tcPr>
+            <w:tcW w:type="dxa" w:w="1900"/>
+            <w:tcMar>
+              <w:top w:type="dxa" w:w="90"/>
+              <w:left w:type="dxa" w:w="120"/>
+              <w:bottom w:type="dxa" w:w="90"/>
+              <w:right w:type="dxa" w:w="120"/>
+            </w:tcMar>
+          </w:tcPr>
+          <w:p>
+            <w:pPr>
+              <w:spacing w:after="120" w:before="0"/>
+            </w:pPr>
+            <w:r>
               <w:t xml:space="preserve"> </w:t>
             </w:r>
           </w:p>
@@ -9556,18 +9565,99 @@
               <w:spacing w:after="120" w:before="0"/>
             </w:pPr>
             <w:r>
-              <w:rPr>
-                <w:rFonts w:ascii="Calibri" w:cs="Calibri" w:eastAsia="Calibri" w:hAnsi="Calibri"/>
+              <w:t xml:space="preserve"> </w:t>
+            </w:r>
+          </w:p>
+        </w:tc>
+        <w:tc>
+          <w:tcPr>
+            <w:tcW w:type="dxa" w:w="2738"/>
+            <w:tcMar>
+              <w:top w:type="dxa" w:w="90"/>
+              <w:left w:type="dxa" w:w="120"/>
+              <w:bottom w:type="dxa" w:w="90"/>
+              <w:right w:type="dxa" w:w="120"/>
+            </w:tcMar>
+          </w:tcPr>
+          <w:p>
+            <w:pPr>
+              <w:spacing w:after="120" w:before="0"/>
+            </w:pPr>
+            <w:r>
+              <w:t xml:space="preserve"> </w:t>
+            </w:r>
+          </w:p>
+        </w:tc>
+      </w:tr>
+      <w:tr>
+        <w:tc>
+          <w:tcPr>
+            <w:tcW w:type="dxa" w:w="3100"/>
+            <w:shd w:fill="EFEFEF" w:color="auto" w:val="clear"/>
+            <w:tcMar>
+              <w:top w:type="dxa" w:w="90"/>
+              <w:left w:type="dxa" w:w="120"/>
+              <w:bottom w:type="dxa" w:w="90"/>
+              <w:right w:type="dxa" w:w="120"/>
+            </w:tcMar>
+          </w:tcPr>
+          <w:p>
+            <w:pPr>
+              <w:spacing w:after="120" w:before="0"/>
+            </w:pPr>
+            <w:r>
+              <w:rPr>
+                <w:rFonts w:ascii="Calibri" w:cs="Calibri" w:eastAsia="Calibri" w:hAnsi="Calibri"/>
+                <w:b/>
+                <w:bCs/>
                 <w:color w:val="1A1A1A"/>
-                <w:sz w:val="20"/>
-                <w:szCs w:val="20"/>
-              </w:rPr>
+                <w:sz w:val="18"/>
+                <w:szCs w:val="18"/>
+              </w:rPr>
+              <w:t xml:space="preserve">Gestione ADV</w:t>
+            </w:r>
+          </w:p>
+        </w:tc>
+        <w:tc>
+          <w:tcPr>
+            <w:tcW w:type="dxa" w:w="1900"/>
+            <w:tcMar>
+              <w:top w:type="dxa" w:w="90"/>
+              <w:left w:type="dxa" w:w="120"/>
+              <w:bottom w:type="dxa" w:w="90"/>
+              <w:right w:type="dxa" w:w="120"/>
+            </w:tcMar>
+          </w:tcPr>
+          <w:p>
+            <w:pPr>
+              <w:spacing w:after="120" w:before="0"/>
+            </w:pPr>
+            <w:r>
               <w:t xml:space="preserve"> </w:t>
             </w:r>
           </w:p>
         </w:tc>
         <w:tc>
           <w:tcPr>
+            <w:tcW w:type="dxa" w:w="1900"/>
+            <w:tcMar>
+              <w:top w:type="dxa" w:w="90"/>
+              <w:left w:type="dxa" w:w="120"/>
+              <w:bottom w:type="dxa" w:w="90"/>
+              <w:right w:type="dxa" w:w="120"/>
+            </w:tcMar>
+          </w:tcPr>
+          <w:p>
+            <w:pPr>
+              <w:spacing w:after="120" w:before="0"/>
+            </w:pPr>
+            <w:r>
+              <w:t xml:space="preserve"> </w:t>
+            </w:r>
+          </w:p>
+        </w:tc>
+        <w:tc>
+          <w:tcPr>
             <w:tcW w:type="dxa" w:w="2738"/>
             <w:tcMar>
               <w:top w:type="dxa" w:w="90"/>
@@ -9581,205 +9671,7 @@
               <w:spacing w:after="120" w:before="0"/>
             </w:pPr>
             <w:r>
-              <w:t>Da definire prima di proporre un «pacchetto completo»: senza questa voce completo non è.</w:t>
-            </w:r>
-          </w:p>
-        </w:tc>
-      </w:tr>
-      <w:tr>
-        <w:tc>
-          <w:tcPr>
-            <w:tcW w:type="dxa" w:w="3100"/>
-            <w:shd w:fill="EFEFEF" w:color="auto" w:val="clear"/>
-            <w:tcMar>
-              <w:top w:type="dxa" w:w="90"/>
-              <w:left w:type="dxa" w:w="120"/>
-              <w:bottom w:type="dxa" w:w="90"/>
-              <w:right w:type="dxa" w:w="120"/>
-            </w:tcMar>
-          </w:tcPr>
-          <w:p>
-            <w:pPr>
-              <w:spacing w:after="120" w:before="0"/>
-            </w:pPr>
-            <w:r>
-              <w:rPr>
-                <w:rFonts w:ascii="Calibri" w:cs="Calibri" w:eastAsia="Calibri" w:hAnsi="Calibri"/>
-                <w:b/>
-                <w:bCs/>
-                <w:color w:val="1A1A1A"/>
-                <w:sz w:val="18"/>
-                <w:szCs w:val="18"/>
-              </w:rPr>
-              <w:t xml:space="preserve">Sviluppo CRM + Email marketing</w:t>
-            </w:r>
-          </w:p>
-        </w:tc>
-        <w:tc>
-          <w:tcPr>
-            <w:tcW w:type="dxa" w:w="1900"/>
-            <w:tcMar>
-              <w:top w:type="dxa" w:w="90"/>
-              <w:left w:type="dxa" w:w="120"/>
-              <w:bottom w:type="dxa" w:w="90"/>
-              <w:right w:type="dxa" w:w="120"/>
-            </w:tcMar>
-          </w:tcPr>
-          <w:p>
-            <w:pPr>
-              <w:spacing w:after="120" w:before="0"/>
-            </w:pPr>
-            <w:r>
-              <w:rPr>
-                <w:rFonts w:ascii="Calibri" w:cs="Calibri" w:eastAsia="Calibri" w:hAnsi="Calibri"/>
-                <w:color w:val="1A1A1A"/>
-                <w:sz w:val="20"/>
-                <w:szCs w:val="20"/>
-              </w:rPr>
               <w:t xml:space="preserve"> </w:t>
-            </w:r>
-          </w:p>
-        </w:tc>
-        <w:tc>
-          <w:tcPr>
-            <w:tcW w:type="dxa" w:w="1900"/>
-            <w:tcMar>
-              <w:top w:type="dxa" w:w="90"/>
-              <w:left w:type="dxa" w:w="120"/>
-              <w:bottom w:type="dxa" w:w="90"/>
-              <w:right w:type="dxa" w:w="120"/>
-            </w:tcMar>
-          </w:tcPr>
-          <w:p>
-            <w:pPr>
-              <w:spacing w:after="120" w:before="0"/>
-            </w:pPr>
-            <w:r>
-              <w:rPr>
-                <w:rFonts w:ascii="Calibri" w:cs="Calibri" w:eastAsia="Calibri" w:hAnsi="Calibri"/>
-                <w:color w:val="1A1A1A"/>
-                <w:sz w:val="20"/>
-                <w:szCs w:val="20"/>
-              </w:rPr>
-              <w:t xml:space="preserve"> </w:t>
-            </w:r>
-          </w:p>
-        </w:tc>
-        <w:tc>
-          <w:tcPr>
-            <w:tcW w:type="dxa" w:w="2738"/>
-            <w:tcMar>
-              <w:top w:type="dxa" w:w="90"/>
-              <w:left w:type="dxa" w:w="120"/>
-              <w:bottom w:type="dxa" w:w="90"/>
-              <w:right w:type="dxa" w:w="120"/>
-            </w:tcMar>
-          </w:tcPr>
-          <w:p>
-            <w:pPr>
-              <w:spacing w:after="120" w:before="0"/>
-            </w:pPr>
-            <w:r>
-              <w:t>Da definire. Su una boutique con clientela di ritorno è la voce che porta più margine al cliente.</w:t>
-            </w:r>
-          </w:p>
-        </w:tc>
-      </w:tr>
-      <w:tr>
-        <w:tc>
-          <w:tcPr>
-            <w:tcW w:type="dxa" w:w="3100"/>
-            <w:shd w:fill="EFEFEF" w:color="auto" w:val="clear"/>
-            <w:tcMar>
-              <w:top w:type="dxa" w:w="90"/>
-              <w:left w:type="dxa" w:w="120"/>
-              <w:bottom w:type="dxa" w:w="90"/>
-              <w:right w:type="dxa" w:w="120"/>
-            </w:tcMar>
-          </w:tcPr>
-          <w:p>
-            <w:pPr>
-              <w:spacing w:after="120" w:before="0"/>
-            </w:pPr>
-            <w:r>
-              <w:rPr>
-                <w:rFonts w:ascii="Calibri" w:cs="Calibri" w:eastAsia="Calibri" w:hAnsi="Calibri"/>
-                <w:b/>
-                <w:bCs/>
-                <w:color w:val="1A1A1A"/>
-                <w:sz w:val="18"/>
-                <w:szCs w:val="18"/>
-              </w:rPr>
-              <w:t xml:space="preserve">Gestione ADV</w:t>
-            </w:r>
-          </w:p>
-        </w:tc>
-        <w:tc>
-          <w:tcPr>
-            <w:tcW w:type="dxa" w:w="1900"/>
-            <w:tcMar>
-              <w:top w:type="dxa" w:w="90"/>
-              <w:left w:type="dxa" w:w="120"/>
-              <w:bottom w:type="dxa" w:w="90"/>
-              <w:right w:type="dxa" w:w="120"/>
-            </w:tcMar>
-          </w:tcPr>
-          <w:p>
-            <w:pPr>
-              <w:spacing w:after="120" w:before="0"/>
-            </w:pPr>
-            <w:r>
-              <w:rPr>
-                <w:rFonts w:ascii="Calibri" w:cs="Calibri" w:eastAsia="Calibri" w:hAnsi="Calibri"/>
-                <w:color w:val="1A1A1A"/>
-                <w:sz w:val="20"/>
-                <w:szCs w:val="20"/>
-              </w:rPr>
-              <w:t xml:space="preserve"> </w:t>
-            </w:r>
-          </w:p>
-        </w:tc>
-        <w:tc>
-          <w:tcPr>
-            <w:tcW w:type="dxa" w:w="1900"/>
-            <w:tcMar>
-              <w:top w:type="dxa" w:w="90"/>
-              <w:left w:type="dxa" w:w="120"/>
-              <w:bottom w:type="dxa" w:w="90"/>
-              <w:right w:type="dxa" w:w="120"/>
-            </w:tcMar>
-          </w:tcPr>
-          <w:p>
-            <w:pPr>
-              <w:spacing w:after="120" w:before="0"/>
-            </w:pPr>
-            <w:r>
-              <w:rPr>
-                <w:rFonts w:ascii="Calibri" w:cs="Calibri" w:eastAsia="Calibri" w:hAnsi="Calibri"/>
-                <w:color w:val="1A1A1A"/>
-                <w:sz w:val="20"/>
-                <w:szCs w:val="20"/>
-              </w:rPr>
-              <w:t xml:space="preserve"> </w:t>
-            </w:r>
-          </w:p>
-        </w:tc>
-        <w:tc>
-          <w:tcPr>
-            <w:tcW w:type="dxa" w:w="2738"/>
-            <w:tcMar>
-              <w:top w:type="dxa" w:w="90"/>
-              <w:left w:type="dxa" w:w="120"/>
-              <w:bottom w:type="dxa" w:w="90"/>
-              <w:right w:type="dxa" w:w="120"/>
-            </w:tcMar>
-          </w:tcPr>
-          <w:p>
-            <w:pPr>
-              <w:spacing w:after="120" w:before="0"/>
-            </w:pPr>
-            <w:r>
-              <w:t>Budget media del cliente; fee di gestione da fissare.</w:t>
             </w:r>
           </w:p>
         </w:tc>
@@ -9829,7 +9721,7 @@
               <w:spacing w:after="120" w:before="0"/>
             </w:pPr>
             <w:r>
-              <w:t>2.100 €</w:t>
+              <w:t xml:space="preserve"> </w:t>
             </w:r>
           </w:p>
         </w:tc>
@@ -9849,7 +9741,7 @@
               <w:spacing w:after="120" w:before="0"/>
             </w:pPr>
             <w:r>
-              <w:t>1.200 € + 350 € l'anno</w:t>
+              <w:t xml:space="preserve"> </w:t>
             </w:r>
           </w:p>
         </w:tc>
@@ -9869,7 +9761,7 @@
               <w:spacing w:after="120" w:before="0"/>
             </w:pPr>
             <w:r>
-              <w:t>DA VERIFICARE — due delle cinque voci sono vuote: il «pacchetto completo» va completato o rinominato.</w:t>
+              <w:t xml:space="preserve"> </w:t>
             </w:r>
           </w:p>
         </w:tc>

</xml_diff>

<commit_message>
Ospitalità: testata a tutta larghezza, uguale in ogni lettore
Word stringeva la tabella al contenuto e lo sfondo di paragrafo sparisce
nei lettori che lo ignorano, portandosi via il titolo bianco. La fascia
ora è un'immagine a 300 dpi larga quanto la colonna di testo; il PNG
sorgente resta in materiali/grafica.

Co-Authored-By: Claude Opus 5 <noreply@anthropic.com>
</commit_message>
<xml_diff>
--- a/materiali/YDG - Ospitalita - PRECOMPILATO 16-10.docx
+++ b/materiali/YDG - Ospitalita - PRECOMPILATO 16-10.docx
@@ -2,85 +2,46 @@
 <file path=word/document.xml><?xml version="1.0" encoding="utf-8"?>
 <w:document xmlns:wpc="http://schemas.microsoft.com/office/word/2010/wordprocessingCanvas" xmlns:mc="http://schemas.openxmlformats.org/markup-compatibility/2006" xmlns:o="urn:schemas-microsoft-com:office:office" xmlns:r="http://schemas.openxmlformats.org/officeDocument/2006/relationships" xmlns:m="http://schemas.openxmlformats.org/officeDocument/2006/math" xmlns:v="urn:schemas-microsoft-com:vml" xmlns:wp14="http://schemas.microsoft.com/office/word/2010/wordprocessingDrawing" xmlns:wp="http://schemas.openxmlformats.org/drawingml/2006/wordprocessingDrawing" xmlns:w10="urn:schemas-microsoft-com:office:word" xmlns:w="http://schemas.openxmlformats.org/wordprocessingml/2006/main" xmlns:w14="http://schemas.microsoft.com/office/word/2010/wordml" xmlns:w15="http://schemas.microsoft.com/office/word/2012/wordml" xmlns:wpg="http://schemas.microsoft.com/office/word/2010/wordprocessingGroup" xmlns:wpi="http://schemas.microsoft.com/office/word/2010/wordprocessingInk" xmlns:wne="http://schemas.microsoft.com/office/word/2006/wordml" xmlns:wps="http://schemas.microsoft.com/office/word/2010/wordprocessingShape" xmlns:cx="http://schemas.microsoft.com/office/drawing/2014/chartex" xmlns:cx1="http://schemas.microsoft.com/office/drawing/2015/9/8/chartex" xmlns:cx2="http://schemas.microsoft.com/office/drawing/2015/10/21/chartex" xmlns:cx3="http://schemas.microsoft.com/office/drawing/2016/5/9/chartex" xmlns:cx4="http://schemas.microsoft.com/office/drawing/2016/5/10/chartex" xmlns:cx5="http://schemas.microsoft.com/office/drawing/2016/5/11/chartex" xmlns:cx6="http://schemas.microsoft.com/office/drawing/2016/5/12/chartex" xmlns:cx7="http://schemas.microsoft.com/office/drawing/2016/5/13/chartex" xmlns:cx8="http://schemas.microsoft.com/office/drawing/2016/5/14/chartex" xmlns:aink="http://schemas.microsoft.com/office/drawing/2016/ink" xmlns:am3d="http://schemas.microsoft.com/office/drawing/2017/model3d" xmlns:w16cex="http://schemas.microsoft.com/office/word/2018/wordml/cex" xmlns:w16cid="http://schemas.microsoft.com/office/word/2016/wordml/cid" xmlns:w16="http://schemas.microsoft.com/office/word/2018/wordml" xmlns:w16sdtdh="http://schemas.microsoft.com/office/word/2020/wordml/sdtdatahash" xmlns:w16se="http://schemas.microsoft.com/office/word/2015/wordml/symex" mc:Ignorable="w14 w15 wp14">
   <w:body>
-    <w:tbl>
-      <w:tblPr>
-        <w:tblLayout w:type="fixed"/>
-        <w:tblLook w:firstColumn="1" w:firstRow="1" w:lastColumn="0" w:lastRow="0" w:noHBand="0" w:noVBand="1" w:val="04A0"/>
-        <w:tblW w:w="5000" w:type="pct"/>
-      </w:tblPr>
-      <w:tblGrid>
-        <w:gridCol w:w="9752"/>
-      </w:tblGrid>
-      <w:tr>
-        <w:tc>
-          <w:tcPr>
-            <w:tcW w:type="dxa" w:w="9752"/>
-            <w:shd w:val="clear" w:fill="0C0C0C"/>
-            <w:tcBorders>
-              <w:top w:val="single" w:sz="2" w:space="0" w:color="0C0C0C"/>
-              <w:left w:val="single" w:sz="2" w:space="0" w:color="0C0C0C"/>
-              <w:bottom w:val="single" w:sz="2" w:space="0" w:color="0C0C0C"/>
-              <w:right w:val="single" w:sz="2" w:space="0" w:color="0C0C0C"/>
-            </w:tcBorders>
-            <w:tcMar>
-              <w:top w:w="320" w:type="dxa"/>
-              <w:start w:w="340" w:type="dxa"/>
-              <w:bottom w:w="360" w:type="dxa"/>
-              <w:end w:w="340" w:type="dxa"/>
-            </w:tcMar>
-          </w:tcPr>
-          <w:p>
-            <w:pPr>
-              <w:spacing w:after="0" w:before="200"/>
-            </w:pPr>
-            <w:r>
-              <w:rPr>
-                <w:rFonts w:ascii="Archivo" w:cs="Archivo" w:eastAsia="Archivo" w:hAnsi="Archivo"/>
-                <w:b/>
-                <w:bCs/>
-                <w:caps/>
-                <w:color w:val="E0661F"/>
-                <w:sz w:val="16"/>
-                <w:szCs w:val="15"/>
-                <w:spacing w:val="28"/>
-              </w:rPr>
-              <w:t>YDG STUDIO</w:t>
-            </w:r>
-          </w:p>
-          <w:p>
-            <w:pPr>
-              <w:spacing w:after="0" w:before="0"/>
-            </w:pPr>
-            <w:r>
-              <w:rPr>
-                <w:rFonts w:ascii="Archivo ExtraBold" w:cs="Archivo ExtraBold" w:eastAsia="Archivo ExtraBold" w:hAnsi="Archivo ExtraBold"/>
-                <w:b w:val="0"/>
-                <w:bCs/>
-                <w:color w:val="F4F3F1"/>
-                <w:sz w:val="46"/>
-                <w:szCs w:val="40"/>
-                <w:spacing w:val="-16"/>
-              </w:rPr>
-              <w:t xml:space="preserve">Verticale ospitalità</w:t>
-            </w:r>
-          </w:p>
-          <w:p>
-            <w:pPr>
-              <w:spacing w:after="280" w:before="0"/>
-            </w:pPr>
-            <w:r>
-              <w:rPr>
-                <w:rFonts w:ascii="Archivo" w:cs="Archivo" w:eastAsia="Archivo" w:hAnsi="Archivo"/>
-                <w:color w:val="A2A2A0"/>
-                <w:sz w:val="20"/>
-                <w:szCs w:val="22"/>
-              </w:rPr>
-              <w:t xml:space="preserve">Documento da compilare · servizi, casi studio e prezzi</w:t>
-            </w:r>
-          </w:p>
-        </w:tc>
-      </w:tr>
-    </w:tbl>
+    <w:p>
+      <w:pPr>
+        <w:spacing w:after="320" w:before="0"/>
+        <w:ind w:left="0" w:right="0"/>
+      </w:pPr>
+      <w:r>
+        <w:drawing>
+          <wp:inline xmlns:a="http://schemas.openxmlformats.org/drawingml/2006/main" xmlns:pic="http://schemas.openxmlformats.org/drawingml/2006/picture">
+            <wp:extent cx="6192000" cy="1097548"/>
+            <wp:docPr id="1" name="Picture 1"/>
+            <wp:cNvGraphicFramePr>
+              <a:graphicFrameLocks noChangeAspect="1"/>
+            </wp:cNvGraphicFramePr>
+            <a:graphic>
+              <a:graphicData uri="http://schemas.openxmlformats.org/drawingml/2006/picture">
+                <pic:pic>
+                  <pic:nvPicPr>
+                    <pic:cNvPr id="0" name="testata.png"/>
+                    <pic:cNvPicPr/>
+                  </pic:nvPicPr>
+                  <pic:blipFill>
+                    <a:blip r:embed="rId8"/>
+                    <a:stretch>
+                      <a:fillRect/>
+                    </a:stretch>
+                  </pic:blipFill>
+                  <pic:spPr>
+                    <a:xfrm>
+                      <a:off x="0" y="0"/>
+                      <a:ext cx="6192000" cy="1097548"/>
+                    </a:xfrm>
+                    <a:prstGeom prst="rect"/>
+                  </pic:spPr>
+                </pic:pic>
+              </a:graphicData>
+            </a:graphic>
+          </wp:inline>
+        </w:drawing>
+      </w:r>
+    </w:p>
     <w:p>
       <w:pPr>
         <w:pBdr>

</xml_diff>